<commit_message>
Moved user-facing text into Android string resources for English, Spanish, and French. Fixed in-app language switching, removed hard-coded localization text, and swapped buttons of + and -
</commit_message>
<xml_diff>
--- a/Inclusivity.docx
+++ b/Inclusivity.docx
@@ -4,25 +4,67 @@
   <w:body>
     <w:p>
       <w:r>
-        <w:t xml:space="preserve">Emergency Helper is an </w:t>
-      </w:r>
-      <w:proofErr w:type="gramStart"/>
-      <w:r>
-        <w:t>inclusivity-focused</w:t>
-      </w:r>
-      <w:proofErr w:type="gramEnd"/>
-      <w:r>
-        <w:t xml:space="preserve"> mobile app that helps users display common emergency phrases in multiple languages while also providing accessibility options such as large text and high contrast mode.</w:t>
+        <w:rPr>
+          <w:b/>
+          <w:bCs/>
+        </w:rPr>
+        <w:t>Overview</w:t>
+      </w:r>
+      <w:r>
+        <w:br/>
+        <w:t>The Inclusivity project is an accessible fitness tracker app built in Android Studio using Kotlin. The app helps users track daily fitness information while supporting different users through internationalization, accessibility options, and responsive layouts for phone</w:t>
+      </w:r>
+      <w:r>
+        <w:t xml:space="preserve"> and</w:t>
+      </w:r>
+      <w:r>
+        <w:t xml:space="preserve"> tablet</w:t>
+      </w:r>
+      <w:r>
+        <w:t>.</w:t>
+      </w:r>
+    </w:p>
+    <w:p>
+      <w:r>
+        <w:rPr>
+          <w:b/>
+          <w:bCs/>
+        </w:rPr>
+        <w:t>Main Features</w:t>
+      </w:r>
+      <w:r>
+        <w:br/>
+        <w:t>The app tracks three fitness categories: steps, calories eaten, and water.</w:t>
+      </w:r>
+    </w:p>
+    <w:p>
+      <w:r>
+        <w:t>The app starts each fitness value at zero so the user can enter their own daily progress.</w:t>
+      </w:r>
+    </w:p>
+    <w:p>
+      <w:r>
+        <w:t>Each category has add and subtract buttons so the user can increase or decrease their values.</w:t>
+      </w:r>
+    </w:p>
+    <w:p>
+      <w:r>
+        <w:t>The app includes a workout plan section where the user can type in their own workout task or plan.</w:t>
+      </w:r>
+    </w:p>
+    <w:p>
+      <w:r>
+        <w:t>The user can save the workout plan and also delete it if they want to remove the task.</w:t>
       </w:r>
     </w:p>
     <w:p>
       <w:r>
         <w:lastRenderedPageBreak/>
         <w:drawing>
-          <wp:inline distT="0" distB="0" distL="0" distR="0" wp14:anchorId="421D577C" wp14:editId="7AB1FA4C">
-            <wp:extent cx="3895725" cy="8229600"/>
-            <wp:effectExtent l="0" t="0" r="9525" b="0"/>
-            <wp:docPr id="1560977312" name="Picture 1"/>
+          <wp:inline distT="0" distB="0" distL="0" distR="0" wp14:anchorId="59BCEE87" wp14:editId="4017A927">
+            <wp:extent cx="3810635" cy="8229600"/>
+            <wp:effectExtent l="0" t="0" r="0" b="0"/>
+            <wp:docPr id="1569649978" name="Picture 1"/>
             <wp:cNvGraphicFramePr>
               <a:graphicFrameLocks xmlns:a="http://schemas.openxmlformats.org/drawingml/2006/main" noChangeAspect="1"/>
             </wp:cNvGraphicFramePr>
@@ -30,7 +72,7 @@
               <a:graphicData uri="http://schemas.openxmlformats.org/drawingml/2006/picture">
                 <pic:pic xmlns:pic="http://schemas.openxmlformats.org/drawingml/2006/picture">
                   <pic:nvPicPr>
-                    <pic:cNvPr id="1560977312" name=""/>
+                    <pic:cNvPr id="1569649978" name=""/>
                     <pic:cNvPicPr/>
                   </pic:nvPicPr>
                   <pic:blipFill>
@@ -42,7 +84,7 @@
                   <pic:spPr>
                     <a:xfrm>
                       <a:off x="0" y="0"/>
-                      <a:ext cx="3895725" cy="8229600"/>
+                      <a:ext cx="3810635" cy="8229600"/>
                     </a:xfrm>
                     <a:prstGeom prst="rect">
                       <a:avLst/>
@@ -62,22 +104,31 @@
           <w:bCs/>
         </w:rPr>
         <w:lastRenderedPageBreak/>
-        <w:t>English Button</w:t>
-      </w:r>
-    </w:p>
-    <w:p>
-      <w:r>
-        <w:t>Changes the app text and emergency phrases to English.</w:t>
+        <w:t>Internationalization</w:t>
+      </w:r>
+      <w:r>
+        <w:br/>
+        <w:t>The app includes multiple language options: English, Spanish, and French.</w:t>
+      </w:r>
+    </w:p>
+    <w:p>
+      <w:r>
+        <w:t>The language controls are placed inside the Settings menu so the main screen stays clean and easy to read.</w:t>
+      </w:r>
+    </w:p>
+    <w:p>
+      <w:r>
+        <w:t>When the user chooses a language, the app updates the labels and buttons to match that language.</w:t>
       </w:r>
     </w:p>
     <w:p>
       <w:r>
         <w:lastRenderedPageBreak/>
         <w:drawing>
-          <wp:inline distT="0" distB="0" distL="0" distR="0" wp14:anchorId="14E58732" wp14:editId="4480390B">
-            <wp:extent cx="3895725" cy="8229600"/>
+          <wp:inline distT="0" distB="0" distL="0" distR="0" wp14:anchorId="2E1407A6" wp14:editId="51764093">
+            <wp:extent cx="3781953" cy="8164064"/>
             <wp:effectExtent l="0" t="0" r="9525" b="0"/>
-            <wp:docPr id="1146076501" name="Picture 1"/>
+            <wp:docPr id="1583902328" name="Picture 1"/>
             <wp:cNvGraphicFramePr>
               <a:graphicFrameLocks xmlns:a="http://schemas.openxmlformats.org/drawingml/2006/main" noChangeAspect="1"/>
             </wp:cNvGraphicFramePr>
@@ -85,62 +136,7 @@
               <a:graphicData uri="http://schemas.openxmlformats.org/drawingml/2006/picture">
                 <pic:pic xmlns:pic="http://schemas.openxmlformats.org/drawingml/2006/picture">
                   <pic:nvPicPr>
-                    <pic:cNvPr id="1146076501" name=""/>
-                    <pic:cNvPicPr/>
-                  </pic:nvPicPr>
-                  <pic:blipFill>
-                    <a:blip r:embed="rId4"/>
-                    <a:stretch>
-                      <a:fillRect/>
-                    </a:stretch>
-                  </pic:blipFill>
-                  <pic:spPr>
-                    <a:xfrm>
-                      <a:off x="0" y="0"/>
-                      <a:ext cx="3895725" cy="8229600"/>
-                    </a:xfrm>
-                    <a:prstGeom prst="rect">
-                      <a:avLst/>
-                    </a:prstGeom>
-                  </pic:spPr>
-                </pic:pic>
-              </a:graphicData>
-            </a:graphic>
-          </wp:inline>
-        </w:drawing>
-      </w:r>
-    </w:p>
-    <w:p>
-      <w:r>
-        <w:rPr>
-          <w:b/>
-          <w:bCs/>
-        </w:rPr>
-        <w:lastRenderedPageBreak/>
-        <w:t>Spanish Button</w:t>
-      </w:r>
-    </w:p>
-    <w:p>
-      <w:r>
-        <w:t>Changes the app text and emergency phrases to Spanish.</w:t>
-      </w:r>
-    </w:p>
-    <w:p>
-      <w:r>
-        <w:lastRenderedPageBreak/>
-        <w:drawing>
-          <wp:inline distT="0" distB="0" distL="0" distR="0" wp14:anchorId="5FD4D662" wp14:editId="03315AA0">
-            <wp:extent cx="3782060" cy="8229600"/>
-            <wp:effectExtent l="0" t="0" r="8890" b="0"/>
-            <wp:docPr id="1983832689" name="Picture 1"/>
-            <wp:cNvGraphicFramePr>
-              <a:graphicFrameLocks xmlns:a="http://schemas.openxmlformats.org/drawingml/2006/main" noChangeAspect="1"/>
-            </wp:cNvGraphicFramePr>
-            <a:graphic xmlns:a="http://schemas.openxmlformats.org/drawingml/2006/main">
-              <a:graphicData uri="http://schemas.openxmlformats.org/drawingml/2006/picture">
-                <pic:pic xmlns:pic="http://schemas.openxmlformats.org/drawingml/2006/picture">
-                  <pic:nvPicPr>
-                    <pic:cNvPr id="1983832689" name=""/>
+                    <pic:cNvPr id="1583902328" name=""/>
                     <pic:cNvPicPr/>
                   </pic:nvPicPr>
                   <pic:blipFill>
@@ -152,7 +148,7 @@
                   <pic:spPr>
                     <a:xfrm>
                       <a:off x="0" y="0"/>
-                      <a:ext cx="3782060" cy="8229600"/>
+                      <a:ext cx="3781953" cy="8164064"/>
                     </a:xfrm>
                     <a:prstGeom prst="rect">
                       <a:avLst/>
@@ -167,27 +163,12 @@
     </w:p>
     <w:p>
       <w:r>
-        <w:rPr>
-          <w:b/>
-          <w:bCs/>
-        </w:rPr>
-        <w:lastRenderedPageBreak/>
-        <w:t>French Button</w:t>
-      </w:r>
-    </w:p>
-    <w:p>
-      <w:r>
-        <w:t>Changes the app text and emergency phrases to French.</w:t>
-      </w:r>
-    </w:p>
-    <w:p>
-      <w:r>
         <w:lastRenderedPageBreak/>
         <w:drawing>
-          <wp:inline distT="0" distB="0" distL="0" distR="0" wp14:anchorId="6ADDCE41" wp14:editId="5A3E7997">
-            <wp:extent cx="4182059" cy="8202170"/>
-            <wp:effectExtent l="0" t="0" r="9525" b="8890"/>
-            <wp:docPr id="1295519636" name="Picture 1"/>
+          <wp:inline distT="0" distB="0" distL="0" distR="0" wp14:anchorId="5950A058" wp14:editId="052435BA">
+            <wp:extent cx="3629532" cy="8183117"/>
+            <wp:effectExtent l="0" t="0" r="9525" b="0"/>
+            <wp:docPr id="134177300" name="Picture 1"/>
             <wp:cNvGraphicFramePr>
               <a:graphicFrameLocks xmlns:a="http://schemas.openxmlformats.org/drawingml/2006/main" noChangeAspect="1"/>
             </wp:cNvGraphicFramePr>
@@ -195,7 +176,7 @@
               <a:graphicData uri="http://schemas.openxmlformats.org/drawingml/2006/picture">
                 <pic:pic xmlns:pic="http://schemas.openxmlformats.org/drawingml/2006/picture">
                   <pic:nvPicPr>
-                    <pic:cNvPr id="1295519636" name=""/>
+                    <pic:cNvPr id="134177300" name=""/>
                     <pic:cNvPicPr/>
                   </pic:nvPicPr>
                   <pic:blipFill>
@@ -207,7 +188,7 @@
                   <pic:spPr>
                     <a:xfrm>
                       <a:off x="0" y="0"/>
-                      <a:ext cx="4182059" cy="8202170"/>
+                      <a:ext cx="3629532" cy="8183117"/>
                     </a:xfrm>
                     <a:prstGeom prst="rect">
                       <a:avLst/>
@@ -222,32 +203,12 @@
     </w:p>
     <w:p>
       <w:r>
-        <w:rPr>
-          <w:b/>
-          <w:bCs/>
-        </w:rPr>
-        <w:lastRenderedPageBreak/>
-        <w:t>Large Text Switch</w:t>
-      </w:r>
-    </w:p>
-    <w:p>
-      <w:proofErr w:type="gramStart"/>
-      <w:r>
-        <w:t>Increases</w:t>
-      </w:r>
-      <w:proofErr w:type="gramEnd"/>
-      <w:r>
-        <w:t xml:space="preserve"> the size of the app’s text to make it easier to read.</w:t>
-      </w:r>
-    </w:p>
-    <w:p>
-      <w:r>
         <w:lastRenderedPageBreak/>
         <w:drawing>
-          <wp:inline distT="0" distB="0" distL="0" distR="0" wp14:anchorId="49F2677F" wp14:editId="737958E3">
-            <wp:extent cx="4029710" cy="8229600"/>
-            <wp:effectExtent l="0" t="0" r="8890" b="0"/>
-            <wp:docPr id="1733255435" name="Picture 1"/>
+          <wp:inline distT="0" distB="0" distL="0" distR="0" wp14:anchorId="79CC1D39" wp14:editId="2689FE42">
+            <wp:extent cx="3580130" cy="8229600"/>
+            <wp:effectExtent l="0" t="0" r="1270" b="0"/>
+            <wp:docPr id="2062234970" name="Picture 1"/>
             <wp:cNvGraphicFramePr>
               <a:graphicFrameLocks xmlns:a="http://schemas.openxmlformats.org/drawingml/2006/main" noChangeAspect="1"/>
             </wp:cNvGraphicFramePr>
@@ -255,7 +216,7 @@
               <a:graphicData uri="http://schemas.openxmlformats.org/drawingml/2006/picture">
                 <pic:pic xmlns:pic="http://schemas.openxmlformats.org/drawingml/2006/picture">
                   <pic:nvPicPr>
-                    <pic:cNvPr id="1733255435" name=""/>
+                    <pic:cNvPr id="2062234970" name=""/>
                     <pic:cNvPicPr/>
                   </pic:nvPicPr>
                   <pic:blipFill>
@@ -267,7 +228,7 @@
                   <pic:spPr>
                     <a:xfrm>
                       <a:off x="0" y="0"/>
-                      <a:ext cx="4029710" cy="8229600"/>
+                      <a:ext cx="3580130" cy="8229600"/>
                     </a:xfrm>
                     <a:prstGeom prst="rect">
                       <a:avLst/>
@@ -287,22 +248,31 @@
           <w:bCs/>
         </w:rPr>
         <w:lastRenderedPageBreak/>
-        <w:t>High Contrast Switch</w:t>
-      </w:r>
-    </w:p>
-    <w:p>
-      <w:r>
-        <w:t>Changes the app colors to improve readability for users who need stronger contrast.</w:t>
+        <w:t>Accessibility</w:t>
+      </w:r>
+      <w:r>
+        <w:br/>
+        <w:t>The Settings menu includes a large text option for users who need easier-to-read text.</w:t>
+      </w:r>
+    </w:p>
+    <w:p>
+      <w:r>
+        <w:t>The Settings menu also includes a high contrast option for users who need stronger color contrast.</w:t>
+      </w:r>
+    </w:p>
+    <w:p>
+      <w:r>
+        <w:t>The buttons and controls include readable labels so the app is easier to use with accessibility tools.</w:t>
       </w:r>
     </w:p>
     <w:p>
       <w:r>
         <w:lastRenderedPageBreak/>
         <w:drawing>
-          <wp:inline distT="0" distB="0" distL="0" distR="0" wp14:anchorId="0F36EF68" wp14:editId="498B3223">
-            <wp:extent cx="3837305" cy="8229600"/>
-            <wp:effectExtent l="0" t="0" r="0" b="0"/>
-            <wp:docPr id="1150693447" name="Picture 1"/>
+          <wp:inline distT="0" distB="0" distL="0" distR="0" wp14:anchorId="6B1E9BB3" wp14:editId="10480F33">
+            <wp:extent cx="3734321" cy="8164064"/>
+            <wp:effectExtent l="0" t="0" r="0" b="8890"/>
+            <wp:docPr id="295968158" name="Picture 1"/>
             <wp:cNvGraphicFramePr>
               <a:graphicFrameLocks xmlns:a="http://schemas.openxmlformats.org/drawingml/2006/main" noChangeAspect="1"/>
             </wp:cNvGraphicFramePr>
@@ -310,7 +280,7 @@
               <a:graphicData uri="http://schemas.openxmlformats.org/drawingml/2006/picture">
                 <pic:pic xmlns:pic="http://schemas.openxmlformats.org/drawingml/2006/picture">
                   <pic:nvPicPr>
-                    <pic:cNvPr id="1150693447" name=""/>
+                    <pic:cNvPr id="295968158" name=""/>
                     <pic:cNvPicPr/>
                   </pic:nvPicPr>
                   <pic:blipFill>
@@ -322,7 +292,7 @@
                   <pic:spPr>
                     <a:xfrm>
                       <a:off x="0" y="0"/>
-                      <a:ext cx="3837305" cy="8229600"/>
+                      <a:ext cx="3734321" cy="8164064"/>
                     </a:xfrm>
                     <a:prstGeom prst="rect">
                       <a:avLst/>
@@ -337,27 +307,12 @@
     </w:p>
     <w:p>
       <w:r>
-        <w:rPr>
-          <w:b/>
-          <w:bCs/>
-        </w:rPr>
-        <w:lastRenderedPageBreak/>
-        <w:t>Emergency Phrase Buttons</w:t>
-      </w:r>
-    </w:p>
-    <w:p>
-      <w:r>
-        <w:t>Displays the selected emergency phrase clearly on the screen for quick communication.</w:t>
-      </w:r>
-    </w:p>
-    <w:p>
-      <w:r>
         <w:lastRenderedPageBreak/>
         <w:drawing>
-          <wp:inline distT="0" distB="0" distL="0" distR="0" wp14:anchorId="5335AB4D" wp14:editId="4CF97FAA">
-            <wp:extent cx="3917950" cy="8229600"/>
-            <wp:effectExtent l="0" t="0" r="6350" b="0"/>
-            <wp:docPr id="1111520658" name="Picture 1"/>
+          <wp:inline distT="0" distB="0" distL="0" distR="0" wp14:anchorId="04B1A14D" wp14:editId="2D85C577">
+            <wp:extent cx="3810635" cy="8229600"/>
+            <wp:effectExtent l="0" t="0" r="0" b="0"/>
+            <wp:docPr id="1778778304" name="Picture 1"/>
             <wp:cNvGraphicFramePr>
               <a:graphicFrameLocks xmlns:a="http://schemas.openxmlformats.org/drawingml/2006/main" noChangeAspect="1"/>
             </wp:cNvGraphicFramePr>
@@ -365,7 +320,7 @@
               <a:graphicData uri="http://schemas.openxmlformats.org/drawingml/2006/picture">
                 <pic:pic xmlns:pic="http://schemas.openxmlformats.org/drawingml/2006/picture">
                   <pic:nvPicPr>
-                    <pic:cNvPr id="1111520658" name=""/>
+                    <pic:cNvPr id="1778778304" name=""/>
                     <pic:cNvPicPr/>
                   </pic:nvPicPr>
                   <pic:blipFill>
@@ -377,7 +332,7 @@
                   <pic:spPr>
                     <a:xfrm>
                       <a:off x="0" y="0"/>
-                      <a:ext cx="3917950" cy="8229600"/>
+                      <a:ext cx="3810635" cy="8229600"/>
                     </a:xfrm>
                     <a:prstGeom prst="rect">
                       <a:avLst/>
@@ -391,19 +346,112 @@
       </w:r>
     </w:p>
     <w:p>
-      <w:pPr>
-        <w:rPr>
-          <w:b/>
-          <w:bCs/>
-        </w:rPr>
-      </w:pPr>
       <w:r>
         <w:rPr>
           <w:b/>
           <w:bCs/>
         </w:rPr>
         <w:lastRenderedPageBreak/>
-        <w:t xml:space="preserve">Skill Demonstrated: </w:t>
+        <w:t>Responsive Design</w:t>
+      </w:r>
+      <w:r>
+        <w:br/>
+        <w:t>The app automatically detects the type of device being used.</w:t>
+      </w:r>
+    </w:p>
+    <w:p>
+      <w:r>
+        <w:t>On a phone, the app uses a stacked layout that is easy to scroll and use with one hand.</w:t>
+      </w:r>
+    </w:p>
+    <w:p>
+      <w:r>
+        <w:t>On a tablet, the app uses a wider layout with more space for the tracker and controls.</w:t>
+      </w:r>
+    </w:p>
+    <w:p>
+      <w:r>
+        <w:t>On a watch or very small screen, the app uses a compact layout designed for smaller displays.</w:t>
+      </w:r>
+    </w:p>
+    <w:p>
+      <w:r>
+        <w:lastRenderedPageBreak/>
+        <w:drawing>
+          <wp:inline distT="0" distB="0" distL="0" distR="0" wp14:anchorId="393E3D89" wp14:editId="23CB78A1">
+            <wp:extent cx="3716655" cy="8229600"/>
+            <wp:effectExtent l="0" t="0" r="0" b="0"/>
+            <wp:docPr id="431374028" name="Picture 1"/>
+            <wp:cNvGraphicFramePr>
+              <a:graphicFrameLocks xmlns:a="http://schemas.openxmlformats.org/drawingml/2006/main" noChangeAspect="1"/>
+            </wp:cNvGraphicFramePr>
+            <a:graphic xmlns:a="http://schemas.openxmlformats.org/drawingml/2006/main">
+              <a:graphicData uri="http://schemas.openxmlformats.org/drawingml/2006/picture">
+                <pic:pic xmlns:pic="http://schemas.openxmlformats.org/drawingml/2006/picture">
+                  <pic:nvPicPr>
+                    <pic:cNvPr id="431374028" name=""/>
+                    <pic:cNvPicPr/>
+                  </pic:nvPicPr>
+                  <pic:blipFill>
+                    <a:blip r:embed="rId10"/>
+                    <a:stretch>
+                      <a:fillRect/>
+                    </a:stretch>
+                  </pic:blipFill>
+                  <pic:spPr>
+                    <a:xfrm>
+                      <a:off x="0" y="0"/>
+                      <a:ext cx="3716655" cy="8229600"/>
+                    </a:xfrm>
+                    <a:prstGeom prst="rect">
+                      <a:avLst/>
+                    </a:prstGeom>
+                  </pic:spPr>
+                </pic:pic>
+              </a:graphicData>
+            </a:graphic>
+          </wp:inline>
+        </w:drawing>
+      </w:r>
+    </w:p>
+    <w:p>
+      <w:r>
+        <w:lastRenderedPageBreak/>
+        <w:drawing>
+          <wp:inline distT="0" distB="0" distL="0" distR="0" wp14:anchorId="5D807F9B" wp14:editId="10A9660A">
+            <wp:extent cx="5943600" cy="3958590"/>
+            <wp:effectExtent l="0" t="0" r="0" b="3810"/>
+            <wp:docPr id="193893656" name="Picture 1"/>
+            <wp:cNvGraphicFramePr>
+              <a:graphicFrameLocks xmlns:a="http://schemas.openxmlformats.org/drawingml/2006/main" noChangeAspect="1"/>
+            </wp:cNvGraphicFramePr>
+            <a:graphic xmlns:a="http://schemas.openxmlformats.org/drawingml/2006/main">
+              <a:graphicData uri="http://schemas.openxmlformats.org/drawingml/2006/picture">
+                <pic:pic xmlns:pic="http://schemas.openxmlformats.org/drawingml/2006/picture">
+                  <pic:nvPicPr>
+                    <pic:cNvPr id="193893656" name=""/>
+                    <pic:cNvPicPr/>
+                  </pic:nvPicPr>
+                  <pic:blipFill>
+                    <a:blip r:embed="rId11"/>
+                    <a:stretch>
+                      <a:fillRect/>
+                    </a:stretch>
+                  </pic:blipFill>
+                  <pic:spPr>
+                    <a:xfrm>
+                      <a:off x="0" y="0"/>
+                      <a:ext cx="5943600" cy="3958590"/>
+                    </a:xfrm>
+                    <a:prstGeom prst="rect">
+                      <a:avLst/>
+                    </a:prstGeom>
+                  </pic:spPr>
+                </pic:pic>
+              </a:graphicData>
+            </a:graphic>
+          </wp:inline>
+        </w:drawing>
       </w:r>
     </w:p>
     <w:p>
@@ -412,12 +460,75 @@
           <w:b/>
           <w:bCs/>
         </w:rPr>
-        <w:t>Debug Code Generated by AI</w:t>
-      </w:r>
-    </w:p>
-    <w:p>
-      <w:r>
-        <w:t>This project demonstrates the skill of debugging AI-generated code because the first version of the app launched to a black screen even though the app was installed and running. To fix the issue, I checked the app behavior, rebuilt the project, and corrected the theme/manifest settings so the actual activity screen displayed properly instead of being hidden by a black splash screen.</w:t>
+        <w:t>Settings Menu</w:t>
+      </w:r>
+      <w:r>
+        <w:br/>
+        <w:t>The app hides language and accessibility controls inside a Settings button.</w:t>
+      </w:r>
+    </w:p>
+    <w:p>
+      <w:r>
+        <w:t>This keeps the main fitness tracker screen focused on the user’s daily fitness data.</w:t>
+      </w:r>
+    </w:p>
+    <w:p>
+      <w:r>
+        <w:t>When the user taps Settings, the menu opens and shows language, large text, and high contrast options.</w:t>
+      </w:r>
+    </w:p>
+    <w:p>
+      <w:r>
+        <w:lastRenderedPageBreak/>
+        <w:drawing>
+          <wp:inline distT="0" distB="0" distL="0" distR="0" wp14:anchorId="5E37545C" wp14:editId="0BAC3C9E">
+            <wp:extent cx="3765550" cy="8229600"/>
+            <wp:effectExtent l="0" t="0" r="6350" b="0"/>
+            <wp:docPr id="1193795930" name="Picture 1"/>
+            <wp:cNvGraphicFramePr>
+              <a:graphicFrameLocks xmlns:a="http://schemas.openxmlformats.org/drawingml/2006/main" noChangeAspect="1"/>
+            </wp:cNvGraphicFramePr>
+            <a:graphic xmlns:a="http://schemas.openxmlformats.org/drawingml/2006/main">
+              <a:graphicData uri="http://schemas.openxmlformats.org/drawingml/2006/picture">
+                <pic:pic xmlns:pic="http://schemas.openxmlformats.org/drawingml/2006/picture">
+                  <pic:nvPicPr>
+                    <pic:cNvPr id="1193795930" name=""/>
+                    <pic:cNvPicPr/>
+                  </pic:nvPicPr>
+                  <pic:blipFill>
+                    <a:blip r:embed="rId12"/>
+                    <a:stretch>
+                      <a:fillRect/>
+                    </a:stretch>
+                  </pic:blipFill>
+                  <pic:spPr>
+                    <a:xfrm>
+                      <a:off x="0" y="0"/>
+                      <a:ext cx="3765550" cy="8229600"/>
+                    </a:xfrm>
+                    <a:prstGeom prst="rect">
+                      <a:avLst/>
+                    </a:prstGeom>
+                  </pic:spPr>
+                </pic:pic>
+              </a:graphicData>
+            </a:graphic>
+          </wp:inline>
+        </w:drawing>
+      </w:r>
+    </w:p>
+    <w:p>
+      <w:r>
+        <w:rPr>
+          <w:b/>
+          <w:bCs/>
+        </w:rPr>
+        <w:lastRenderedPageBreak/>
+        <w:t>Skill Demonstrated: Alter Code Generated By AI To Add A Feature</w:t>
+      </w:r>
+      <w:r>
+        <w:br/>
+        <w:t>This project demonstrates altering AI-generated code to add new features. The original app was changed into a more complete accessible fitness tracker by adding automatic device layout detection, a hidden Settings menu, language switching, accessibility toggles, add and subtract controls, and a save/delete workout plan feature. These changes show that I was able to modify generated code and expand it into a more useful mobile app.</w:t>
       </w:r>
     </w:p>
     <w:p/>

</xml_diff>